<commit_message>
fix: require token for location picker page
</commit_message>
<xml_diff>
--- a/location-picker/cloudflare-webui/Cloudflare网页部署教程.docx
+++ b/location-picker/cloudflare-webui/Cloudflare网页部署教程.docx
@@ -235,7 +235,21 @@
     </w:p>
     <w:p>
       <w:r>
-        <w:t>部署后访问 Worker 主页，如果能看到地图页面，说明代码部分已经成功。</w:t>
+        <w:t>部署后访问带 TOKEN 的 Worker 主页，如果能看到地图页面，说明代码部分已经成功。例如：</w:t>
+      </w:r>
+    </w:p>
+    <w:p>
+      <w:r>
+        <w:rPr>
+          <w:rFonts w:ascii="Courier New" w:hAnsi="Courier New"/>
+          <w:sz w:val="18"/>
+        </w:rPr>
+        <w:t>https://你的Worker地址/?token=你的TOKEN</w:t>
+      </w:r>
+    </w:p>
+    <w:p>
+      <w:r>
+        <w:t>不带 TOKEN 访问主页应该返回 403。</w:t>
       </w:r>
     </w:p>
     <w:p>
@@ -1036,7 +1050,35 @@
     </w:p>
     <w:p>
       <w:r>
-        <w:t>默认是正常的。地图页面本身可以打开，但真正读写坐标的接口需要 TOKEN。</w:t>
+        <w:t>新版单文件 Worker 已经收紧为：地图主页也必须带正确 TOKEN 才能打开。</w:t>
+      </w:r>
+    </w:p>
+    <w:p>
+      <w:r>
+        <w:t>不带 TOKEN 访问：</w:t>
+      </w:r>
+    </w:p>
+    <w:p>
+      <w:r>
+        <w:rPr>
+          <w:rFonts w:ascii="Courier New" w:hAnsi="Courier New"/>
+          <w:sz w:val="18"/>
+        </w:rPr>
+        <w:t>https://你的域名/</w:t>
+      </w:r>
+    </w:p>
+    <w:p>
+      <w:r>
+        <w:t>应该返回：</w:t>
+      </w:r>
+    </w:p>
+    <w:p>
+      <w:r>
+        <w:rPr>
+          <w:rFonts w:ascii="Courier New" w:hAnsi="Courier New"/>
+          <w:sz w:val="18"/>
+        </w:rPr>
+        <w:t>{"error":"bad token"}</w:t>
       </w:r>
     </w:p>
     <w:p>

</xml_diff>